<commit_message>
dodao iskljucivanje odg u template
</commit_message>
<xml_diff>
--- a/izvestaj_template.docx
+++ b/izvestaj_template.docx
@@ -1459,7 +1459,7 @@
           <w:sz w:val="24"/>
           <w:szCs w:val="24"/>
         </w:rPr>
-        <w:t>Sekvencee</w:t>
+        <w:t>Sekvence</w:t>
       </w:r>
       <w:proofErr w:type="spellEnd"/>
       <w:r>
@@ -2020,6 +2020,125 @@
           <w:szCs w:val="24"/>
         </w:rPr>
         <w:t>geni</w:t>
+      </w:r>
+      <w:proofErr w:type="spellEnd"/>
+      <w:r>
+        <w:rPr>
+          <w:sz w:val="24"/>
+          <w:szCs w:val="24"/>
+        </w:rPr>
+        <w:t xml:space="preserve"> </w:t>
+      </w:r>
+      <w:proofErr w:type="spellStart"/>
+      <w:r>
+        <w:rPr>
+          <w:sz w:val="24"/>
+          <w:szCs w:val="24"/>
+        </w:rPr>
+        <w:t>k</w:t>
+      </w:r>
+      <w:r>
+        <w:rPr>
+          <w:sz w:val="24"/>
+          <w:szCs w:val="24"/>
+        </w:rPr>
+        <w:t>oji</w:t>
+      </w:r>
+      <w:proofErr w:type="spellEnd"/>
+      <w:r>
+        <w:rPr>
+          <w:sz w:val="24"/>
+          <w:szCs w:val="24"/>
+        </w:rPr>
+        <w:t xml:space="preserve"> </w:t>
+      </w:r>
+      <w:proofErr w:type="spellStart"/>
+      <w:r>
+        <w:rPr>
+          <w:sz w:val="24"/>
+          <w:szCs w:val="24"/>
+        </w:rPr>
+        <w:t>su</w:t>
+      </w:r>
+      <w:proofErr w:type="spellEnd"/>
+      <w:r>
+        <w:rPr>
+          <w:sz w:val="24"/>
+          <w:szCs w:val="24"/>
+        </w:rPr>
+        <w:t xml:space="preserve"> u OMIM </w:t>
+      </w:r>
+      <w:proofErr w:type="spellStart"/>
+      <w:r>
+        <w:rPr>
+          <w:sz w:val="24"/>
+          <w:szCs w:val="24"/>
+        </w:rPr>
+        <w:t>bazi</w:t>
+      </w:r>
+      <w:proofErr w:type="spellEnd"/>
+      <w:r>
+        <w:rPr>
+          <w:sz w:val="24"/>
+          <w:szCs w:val="24"/>
+        </w:rPr>
+        <w:t xml:space="preserve"> </w:t>
+      </w:r>
+      <w:proofErr w:type="spellStart"/>
+      <w:r>
+        <w:rPr>
+          <w:sz w:val="24"/>
+          <w:szCs w:val="24"/>
+        </w:rPr>
+        <w:t>povezani</w:t>
+      </w:r>
+      <w:proofErr w:type="spellEnd"/>
+      <w:r>
+        <w:rPr>
+          <w:sz w:val="24"/>
+          <w:szCs w:val="24"/>
+        </w:rPr>
+        <w:t xml:space="preserve"> </w:t>
+      </w:r>
+      <w:proofErr w:type="spellStart"/>
+      <w:r>
+        <w:rPr>
+          <w:sz w:val="24"/>
+          <w:szCs w:val="24"/>
+        </w:rPr>
+        <w:t>sa</w:t>
+      </w:r>
+      <w:proofErr w:type="spellEnd"/>
+      <w:r>
+        <w:rPr>
+          <w:sz w:val="24"/>
+          <w:szCs w:val="24"/>
+        </w:rPr>
+        <w:t xml:space="preserve"> </w:t>
+      </w:r>
+      <w:proofErr w:type="spellStart"/>
+      <w:r>
+        <w:rPr>
+          <w:sz w:val="24"/>
+          <w:szCs w:val="24"/>
+        </w:rPr>
+        <w:t>kliničkim</w:t>
+      </w:r>
+      <w:proofErr w:type="spellEnd"/>
+      <w:r>
+        <w:rPr>
+          <w:sz w:val="24"/>
+          <w:szCs w:val="24"/>
+        </w:rPr>
+        <w:t xml:space="preserve"> </w:t>
+      </w:r>
+      <w:proofErr w:type="spellStart"/>
+      <w:r>
+        <w:rPr>
+          <w:sz w:val="24"/>
+          <w:szCs w:val="24"/>
+        </w:rPr>
+        <w:t>fenotipom</w:t>
       </w:r>
       <w:proofErr w:type="spellEnd"/>
       <w:r>
@@ -12261,14 +12380,7 @@
                 <w:sz w:val="24"/>
                 <w:szCs w:val="24"/>
               </w:rPr>
-              <w:t xml:space="preserve"> </w:t>
-            </w:r>
-            <w:r>
-              <w:rPr>
-                <w:sz w:val="24"/>
-                <w:szCs w:val="24"/>
-              </w:rPr>
-              <w:t xml:space="preserve">Vladimir </w:t>
+              <w:t xml:space="preserve"> Vladimir </w:t>
             </w:r>
             <w:proofErr w:type="spellStart"/>
             <w:r>
@@ -12738,14 +12850,7 @@
                 <w:sz w:val="24"/>
                 <w:szCs w:val="24"/>
               </w:rPr>
-              <w:t>izvrši</w:t>
-            </w:r>
-            <w:r>
-              <w:rPr>
-                <w:sz w:val="24"/>
-                <w:szCs w:val="24"/>
-              </w:rPr>
-              <w:t>la</w:t>
+              <w:t>izvršila</w:t>
             </w:r>
             <w:proofErr w:type="spellEnd"/>
           </w:p>
@@ -12924,29 +13029,15 @@
                 <w:sz w:val="24"/>
                 <w:szCs w:val="24"/>
               </w:rPr>
-              <w:t xml:space="preserve"> </w:t>
-            </w:r>
-            <w:r>
-              <w:rPr>
-                <w:sz w:val="24"/>
-                <w:szCs w:val="24"/>
-              </w:rPr>
-              <w:t xml:space="preserve">Irena </w:t>
-            </w:r>
-            <w:proofErr w:type="spellStart"/>
-            <w:r>
-              <w:rPr>
-                <w:sz w:val="24"/>
-                <w:szCs w:val="24"/>
-              </w:rPr>
-              <w:t>Marjanov</w:t>
-            </w:r>
-            <w:r>
-              <w:rPr>
-                <w:sz w:val="24"/>
-                <w:szCs w:val="24"/>
-              </w:rPr>
-              <w:t>ić</w:t>
+              <w:t xml:space="preserve"> Irena </w:t>
+            </w:r>
+            <w:proofErr w:type="spellStart"/>
+            <w:r>
+              <w:rPr>
+                <w:sz w:val="24"/>
+                <w:szCs w:val="24"/>
+              </w:rPr>
+              <w:t>Marjanović</w:t>
             </w:r>
             <w:proofErr w:type="spellEnd"/>
           </w:p>
@@ -13327,14 +13418,7 @@
           <w:sz w:val="24"/>
           <w:szCs w:val="24"/>
         </w:rPr>
-        <w:t>Skak</w:t>
-      </w:r>
-      <w:r>
-        <w:rPr>
-          <w:sz w:val="24"/>
-          <w:szCs w:val="24"/>
-        </w:rPr>
-        <w:t>ić</w:t>
+        <w:t>Skakić</w:t>
       </w:r>
       <w:proofErr w:type="spellEnd"/>
       <w:r>
@@ -13415,14 +13499,7 @@
                 <w:sz w:val="24"/>
                 <w:szCs w:val="24"/>
               </w:rPr>
-              <w:t>izvrši</w:t>
-            </w:r>
-            <w:r>
-              <w:rPr>
-                <w:sz w:val="24"/>
-                <w:szCs w:val="24"/>
-              </w:rPr>
-              <w:t>la</w:t>
+              <w:t>izvršila</w:t>
             </w:r>
             <w:proofErr w:type="spellEnd"/>
           </w:p>
@@ -13599,29 +13676,15 @@
                 <w:sz w:val="24"/>
                 <w:szCs w:val="24"/>
               </w:rPr>
-              <w:t xml:space="preserve"> </w:t>
-            </w:r>
-            <w:r>
-              <w:rPr>
-                <w:sz w:val="24"/>
-                <w:szCs w:val="24"/>
-              </w:rPr>
-              <w:t xml:space="preserve">Anita </w:t>
-            </w:r>
-            <w:proofErr w:type="spellStart"/>
-            <w:r>
-              <w:rPr>
-                <w:sz w:val="24"/>
-                <w:szCs w:val="24"/>
-              </w:rPr>
-              <w:t>Skaki</w:t>
-            </w:r>
-            <w:r>
-              <w:rPr>
-                <w:sz w:val="24"/>
-                <w:szCs w:val="24"/>
-              </w:rPr>
-              <w:t>ć</w:t>
+              <w:t xml:space="preserve"> Anita </w:t>
+            </w:r>
+            <w:proofErr w:type="spellStart"/>
+            <w:r>
+              <w:rPr>
+                <w:sz w:val="24"/>
+                <w:szCs w:val="24"/>
+              </w:rPr>
+              <w:t>Skakić</w:t>
             </w:r>
             <w:proofErr w:type="spellEnd"/>
           </w:p>
@@ -14012,14 +14075,7 @@
           <w:sz w:val="24"/>
           <w:szCs w:val="24"/>
         </w:rPr>
-        <w:t>Ristivojev</w:t>
-      </w:r>
-      <w:r>
-        <w:rPr>
-          <w:sz w:val="24"/>
-          <w:szCs w:val="24"/>
-        </w:rPr>
-        <w:t>ić</w:t>
+        <w:t>Ristivojević</w:t>
       </w:r>
       <w:proofErr w:type="spellEnd"/>
       <w:r>
@@ -15369,29 +15425,15 @@
                 <w:sz w:val="24"/>
                 <w:szCs w:val="24"/>
               </w:rPr>
-              <w:t xml:space="preserve"> </w:t>
-            </w:r>
-            <w:r>
-              <w:rPr>
-                <w:sz w:val="24"/>
-                <w:szCs w:val="24"/>
-              </w:rPr>
-              <w:t xml:space="preserve">Marina </w:t>
-            </w:r>
-            <w:proofErr w:type="spellStart"/>
-            <w:r>
-              <w:rPr>
-                <w:sz w:val="24"/>
-                <w:szCs w:val="24"/>
-              </w:rPr>
-              <w:t>Parezanov</w:t>
-            </w:r>
-            <w:r>
-              <w:rPr>
-                <w:sz w:val="24"/>
-                <w:szCs w:val="24"/>
-              </w:rPr>
-              <w:t>ić</w:t>
+              <w:t xml:space="preserve"> Marina </w:t>
+            </w:r>
+            <w:proofErr w:type="spellStart"/>
+            <w:r>
+              <w:rPr>
+                <w:sz w:val="24"/>
+                <w:szCs w:val="24"/>
+              </w:rPr>
+              <w:t>Parezanović</w:t>
             </w:r>
             <w:proofErr w:type="spellEnd"/>
           </w:p>
@@ -16328,14 +16370,7 @@
                 <w:sz w:val="24"/>
                 <w:szCs w:val="24"/>
               </w:rPr>
-              <w:t>Pavlov</w:t>
-            </w:r>
-            <w:r>
-              <w:rPr>
-                <w:sz w:val="24"/>
-                <w:szCs w:val="24"/>
-              </w:rPr>
-              <w:t>ić</w:t>
+              <w:t>Pavlović</w:t>
             </w:r>
             <w:proofErr w:type="spellEnd"/>
           </w:p>
@@ -19269,8 +19304,6 @@
         <w:spacing w:after="200" w:line="240" w:lineRule="auto"/>
         <w:jc w:val="both"/>
         <w:rPr>
-          <w:b/>
-          <w:bCs/>
           <w:color w:val="000000"/>
           <w:sz w:val="24"/>
           <w:szCs w:val="24"/>
@@ -19283,61 +19316,683 @@
           <w:sz w:val="24"/>
           <w:szCs w:val="24"/>
         </w:rPr>
-        <w:t>Laboratorija</w:t>
-      </w:r>
-      <w:proofErr w:type="spellEnd"/>
-      <w:r>
-        <w:rPr>
-          <w:color w:val="000000"/>
-          <w:sz w:val="24"/>
-          <w:szCs w:val="24"/>
-        </w:rPr>
-        <w:t xml:space="preserve"> </w:t>
-      </w:r>
-      <w:proofErr w:type="spellStart"/>
-      <w:r>
-        <w:rPr>
-          <w:color w:val="000000"/>
-          <w:sz w:val="24"/>
-          <w:szCs w:val="24"/>
-        </w:rPr>
-        <w:t>za</w:t>
-      </w:r>
-      <w:proofErr w:type="spellEnd"/>
-      <w:r>
-        <w:rPr>
-          <w:color w:val="000000"/>
-          <w:sz w:val="24"/>
-          <w:szCs w:val="24"/>
-        </w:rPr>
-        <w:t xml:space="preserve"> </w:t>
-      </w:r>
-      <w:proofErr w:type="spellStart"/>
-      <w:r>
-        <w:rPr>
-          <w:color w:val="000000"/>
-          <w:sz w:val="24"/>
-          <w:szCs w:val="24"/>
-        </w:rPr>
-        <w:t>molekularnu</w:t>
-      </w:r>
-      <w:proofErr w:type="spellEnd"/>
-      <w:r>
-        <w:rPr>
-          <w:color w:val="000000"/>
-          <w:sz w:val="24"/>
-          <w:szCs w:val="24"/>
-        </w:rPr>
-        <w:t xml:space="preserve"> </w:t>
-      </w:r>
-      <w:proofErr w:type="spellStart"/>
-      <w:r>
-        <w:rPr>
-          <w:color w:val="000000"/>
-          <w:sz w:val="24"/>
-          <w:szCs w:val="24"/>
-        </w:rPr>
-        <w:t>biomedicinu</w:t>
+        <w:t>Rezultat</w:t>
+      </w:r>
+      <w:proofErr w:type="spellEnd"/>
+      <w:r>
+        <w:rPr>
+          <w:color w:val="000000"/>
+          <w:sz w:val="24"/>
+          <w:szCs w:val="24"/>
+        </w:rPr>
+        <w:t xml:space="preserve"> </w:t>
+      </w:r>
+      <w:proofErr w:type="spellStart"/>
+      <w:r>
+        <w:rPr>
+          <w:color w:val="000000"/>
+          <w:sz w:val="24"/>
+          <w:szCs w:val="24"/>
+        </w:rPr>
+        <w:t>genetičke</w:t>
+      </w:r>
+      <w:proofErr w:type="spellEnd"/>
+      <w:r>
+        <w:rPr>
+          <w:color w:val="000000"/>
+          <w:sz w:val="24"/>
+          <w:szCs w:val="24"/>
+        </w:rPr>
+        <w:t xml:space="preserve"> </w:t>
+      </w:r>
+      <w:proofErr w:type="spellStart"/>
+      <w:r>
+        <w:rPr>
+          <w:color w:val="000000"/>
+          <w:sz w:val="24"/>
+          <w:szCs w:val="24"/>
+        </w:rPr>
+        <w:t>analize</w:t>
+      </w:r>
+      <w:proofErr w:type="spellEnd"/>
+      <w:r>
+        <w:rPr>
+          <w:color w:val="000000"/>
+          <w:sz w:val="24"/>
+          <w:szCs w:val="24"/>
+        </w:rPr>
+        <w:t xml:space="preserve"> </w:t>
+      </w:r>
+      <w:proofErr w:type="spellStart"/>
+      <w:r>
+        <w:rPr>
+          <w:color w:val="000000"/>
+          <w:sz w:val="24"/>
+          <w:szCs w:val="24"/>
+        </w:rPr>
+        <w:t>pacijenta</w:t>
+      </w:r>
+      <w:proofErr w:type="spellEnd"/>
+      <w:r>
+        <w:rPr>
+          <w:color w:val="000000"/>
+          <w:sz w:val="24"/>
+          <w:szCs w:val="24"/>
+        </w:rPr>
+        <w:t xml:space="preserve"> </w:t>
+      </w:r>
+      <w:proofErr w:type="spellStart"/>
+      <w:r>
+        <w:rPr>
+          <w:color w:val="000000"/>
+          <w:sz w:val="24"/>
+          <w:szCs w:val="24"/>
+        </w:rPr>
+        <w:t>može</w:t>
+      </w:r>
+      <w:proofErr w:type="spellEnd"/>
+      <w:r>
+        <w:rPr>
+          <w:color w:val="000000"/>
+          <w:sz w:val="24"/>
+          <w:szCs w:val="24"/>
+        </w:rPr>
+        <w:t xml:space="preserve"> </w:t>
+      </w:r>
+      <w:proofErr w:type="spellStart"/>
+      <w:r>
+        <w:rPr>
+          <w:color w:val="000000"/>
+          <w:sz w:val="24"/>
+          <w:szCs w:val="24"/>
+        </w:rPr>
+        <w:t>biti</w:t>
+      </w:r>
+      <w:proofErr w:type="spellEnd"/>
+      <w:r>
+        <w:rPr>
+          <w:color w:val="000000"/>
+          <w:sz w:val="24"/>
+          <w:szCs w:val="24"/>
+        </w:rPr>
+        <w:t xml:space="preserve"> </w:t>
+      </w:r>
+      <w:proofErr w:type="spellStart"/>
+      <w:r>
+        <w:rPr>
+          <w:color w:val="000000"/>
+          <w:sz w:val="24"/>
+          <w:szCs w:val="24"/>
+        </w:rPr>
+        <w:t>takav</w:t>
+      </w:r>
+      <w:proofErr w:type="spellEnd"/>
+      <w:r>
+        <w:rPr>
+          <w:color w:val="000000"/>
+          <w:sz w:val="24"/>
+          <w:szCs w:val="24"/>
+        </w:rPr>
+        <w:t xml:space="preserve"> da </w:t>
+      </w:r>
+      <w:proofErr w:type="spellStart"/>
+      <w:r>
+        <w:rPr>
+          <w:color w:val="000000"/>
+          <w:sz w:val="24"/>
+          <w:szCs w:val="24"/>
+        </w:rPr>
+        <w:t>uzročna</w:t>
+      </w:r>
+      <w:proofErr w:type="spellEnd"/>
+      <w:r>
+        <w:rPr>
+          <w:color w:val="000000"/>
+          <w:sz w:val="24"/>
+          <w:szCs w:val="24"/>
+        </w:rPr>
+        <w:t xml:space="preserve"> </w:t>
+      </w:r>
+      <w:proofErr w:type="spellStart"/>
+      <w:r>
+        <w:rPr>
+          <w:color w:val="000000"/>
+          <w:sz w:val="24"/>
+          <w:szCs w:val="24"/>
+        </w:rPr>
+        <w:t>genetička</w:t>
+      </w:r>
+      <w:proofErr w:type="spellEnd"/>
+      <w:r>
+        <w:rPr>
+          <w:color w:val="000000"/>
+          <w:sz w:val="24"/>
+          <w:szCs w:val="24"/>
+        </w:rPr>
+        <w:t xml:space="preserve"> </w:t>
+      </w:r>
+      <w:proofErr w:type="spellStart"/>
+      <w:r>
+        <w:rPr>
+          <w:color w:val="000000"/>
+          <w:sz w:val="24"/>
+          <w:szCs w:val="24"/>
+        </w:rPr>
+        <w:t>varijanta</w:t>
+      </w:r>
+      <w:proofErr w:type="spellEnd"/>
+      <w:r>
+        <w:rPr>
+          <w:color w:val="000000"/>
+          <w:sz w:val="24"/>
+          <w:szCs w:val="24"/>
+        </w:rPr>
+        <w:t xml:space="preserve"> </w:t>
+      </w:r>
+      <w:proofErr w:type="spellStart"/>
+      <w:r>
+        <w:rPr>
+          <w:color w:val="000000"/>
+          <w:sz w:val="24"/>
+          <w:szCs w:val="24"/>
+        </w:rPr>
+        <w:t>bude</w:t>
+      </w:r>
+      <w:proofErr w:type="spellEnd"/>
+      <w:r>
+        <w:rPr>
+          <w:color w:val="000000"/>
+          <w:sz w:val="24"/>
+          <w:szCs w:val="24"/>
+        </w:rPr>
+        <w:t xml:space="preserve"> </w:t>
+      </w:r>
+      <w:proofErr w:type="spellStart"/>
+      <w:r>
+        <w:rPr>
+          <w:color w:val="000000"/>
+          <w:sz w:val="24"/>
+          <w:szCs w:val="24"/>
+        </w:rPr>
+        <w:t>detektovana</w:t>
+      </w:r>
+      <w:proofErr w:type="spellEnd"/>
+      <w:r>
+        <w:rPr>
+          <w:color w:val="000000"/>
+          <w:sz w:val="24"/>
+          <w:szCs w:val="24"/>
+        </w:rPr>
+        <w:t xml:space="preserve">, da ne </w:t>
+      </w:r>
+      <w:proofErr w:type="spellStart"/>
+      <w:r>
+        <w:rPr>
+          <w:color w:val="000000"/>
+          <w:sz w:val="24"/>
+          <w:szCs w:val="24"/>
+        </w:rPr>
+        <w:t>bude</w:t>
+      </w:r>
+      <w:proofErr w:type="spellEnd"/>
+      <w:r>
+        <w:rPr>
+          <w:color w:val="000000"/>
+          <w:sz w:val="24"/>
+          <w:szCs w:val="24"/>
+        </w:rPr>
+        <w:t xml:space="preserve"> </w:t>
+      </w:r>
+      <w:proofErr w:type="spellStart"/>
+      <w:r>
+        <w:rPr>
+          <w:color w:val="000000"/>
+          <w:sz w:val="24"/>
+          <w:szCs w:val="24"/>
+        </w:rPr>
+        <w:t>detektovana</w:t>
+      </w:r>
+      <w:proofErr w:type="spellEnd"/>
+      <w:r>
+        <w:rPr>
+          <w:color w:val="000000"/>
+          <w:sz w:val="24"/>
+          <w:szCs w:val="24"/>
+        </w:rPr>
+        <w:t>,</w:t>
+      </w:r>
+      <w:bookmarkStart w:id="1" w:name="_GoBack"/>
+      <w:bookmarkEnd w:id="1"/>
+      <w:r>
+        <w:rPr>
+          <w:color w:val="000000"/>
+          <w:sz w:val="24"/>
+          <w:szCs w:val="24"/>
+        </w:rPr>
+        <w:t xml:space="preserve"> </w:t>
+      </w:r>
+      <w:proofErr w:type="spellStart"/>
+      <w:r>
+        <w:rPr>
+          <w:color w:val="000000"/>
+          <w:sz w:val="24"/>
+          <w:szCs w:val="24"/>
+        </w:rPr>
+        <w:t>ili</w:t>
+      </w:r>
+      <w:proofErr w:type="spellEnd"/>
+      <w:r>
+        <w:rPr>
+          <w:color w:val="000000"/>
+          <w:sz w:val="24"/>
+          <w:szCs w:val="24"/>
+        </w:rPr>
+        <w:t xml:space="preserve"> da </w:t>
+      </w:r>
+      <w:proofErr w:type="spellStart"/>
+      <w:r>
+        <w:rPr>
+          <w:color w:val="000000"/>
+          <w:sz w:val="24"/>
+          <w:szCs w:val="24"/>
+        </w:rPr>
+        <w:t>bude</w:t>
+      </w:r>
+      <w:proofErr w:type="spellEnd"/>
+      <w:r>
+        <w:rPr>
+          <w:color w:val="000000"/>
+          <w:sz w:val="24"/>
+          <w:szCs w:val="24"/>
+        </w:rPr>
+        <w:t xml:space="preserve"> </w:t>
+      </w:r>
+      <w:proofErr w:type="spellStart"/>
+      <w:r>
+        <w:rPr>
+          <w:color w:val="000000"/>
+          <w:sz w:val="24"/>
+          <w:szCs w:val="24"/>
+        </w:rPr>
+        <w:t>detektovana</w:t>
+      </w:r>
+      <w:proofErr w:type="spellEnd"/>
+      <w:r>
+        <w:rPr>
+          <w:color w:val="000000"/>
+          <w:sz w:val="24"/>
+          <w:szCs w:val="24"/>
+        </w:rPr>
+        <w:t xml:space="preserve"> </w:t>
+      </w:r>
+      <w:proofErr w:type="spellStart"/>
+      <w:r>
+        <w:rPr>
+          <w:color w:val="000000"/>
+          <w:sz w:val="24"/>
+          <w:szCs w:val="24"/>
+        </w:rPr>
+        <w:t>genetička</w:t>
+      </w:r>
+      <w:proofErr w:type="spellEnd"/>
+      <w:r>
+        <w:rPr>
+          <w:color w:val="000000"/>
+          <w:sz w:val="24"/>
+          <w:szCs w:val="24"/>
+        </w:rPr>
+        <w:t xml:space="preserve"> </w:t>
+      </w:r>
+      <w:proofErr w:type="spellStart"/>
+      <w:r>
+        <w:rPr>
+          <w:color w:val="000000"/>
+          <w:sz w:val="24"/>
+          <w:szCs w:val="24"/>
+        </w:rPr>
+        <w:t>varijanta</w:t>
+      </w:r>
+      <w:proofErr w:type="spellEnd"/>
+      <w:r>
+        <w:rPr>
+          <w:color w:val="000000"/>
+          <w:sz w:val="24"/>
+          <w:szCs w:val="24"/>
+        </w:rPr>
+        <w:t xml:space="preserve"> </w:t>
+      </w:r>
+      <w:proofErr w:type="spellStart"/>
+      <w:r>
+        <w:rPr>
+          <w:color w:val="000000"/>
+          <w:sz w:val="24"/>
+          <w:szCs w:val="24"/>
+        </w:rPr>
+        <w:t>čiji</w:t>
+      </w:r>
+      <w:proofErr w:type="spellEnd"/>
+      <w:r>
+        <w:rPr>
+          <w:color w:val="000000"/>
+          <w:sz w:val="24"/>
+          <w:szCs w:val="24"/>
+        </w:rPr>
+        <w:t xml:space="preserve"> </w:t>
+      </w:r>
+      <w:proofErr w:type="spellStart"/>
+      <w:r>
+        <w:rPr>
+          <w:color w:val="000000"/>
+          <w:sz w:val="24"/>
+          <w:szCs w:val="24"/>
+        </w:rPr>
+        <w:t>klinički</w:t>
+      </w:r>
+      <w:proofErr w:type="spellEnd"/>
+      <w:r>
+        <w:rPr>
+          <w:color w:val="000000"/>
+          <w:sz w:val="24"/>
+          <w:szCs w:val="24"/>
+        </w:rPr>
+        <w:t xml:space="preserve"> </w:t>
+      </w:r>
+      <w:proofErr w:type="spellStart"/>
+      <w:r>
+        <w:rPr>
+          <w:color w:val="000000"/>
+          <w:sz w:val="24"/>
+          <w:szCs w:val="24"/>
+        </w:rPr>
+        <w:t>značaj</w:t>
+      </w:r>
+      <w:proofErr w:type="spellEnd"/>
+      <w:r>
+        <w:rPr>
+          <w:color w:val="000000"/>
+          <w:sz w:val="24"/>
+          <w:szCs w:val="24"/>
+        </w:rPr>
+        <w:t xml:space="preserve"> </w:t>
+      </w:r>
+      <w:proofErr w:type="spellStart"/>
+      <w:r>
+        <w:rPr>
+          <w:color w:val="000000"/>
+          <w:sz w:val="24"/>
+          <w:szCs w:val="24"/>
+        </w:rPr>
+        <w:t>još</w:t>
+      </w:r>
+      <w:proofErr w:type="spellEnd"/>
+      <w:r>
+        <w:rPr>
+          <w:color w:val="000000"/>
+          <w:sz w:val="24"/>
+          <w:szCs w:val="24"/>
+        </w:rPr>
+        <w:t xml:space="preserve"> </w:t>
+      </w:r>
+      <w:proofErr w:type="spellStart"/>
+      <w:r>
+        <w:rPr>
+          <w:color w:val="000000"/>
+          <w:sz w:val="24"/>
+          <w:szCs w:val="24"/>
+        </w:rPr>
+        <w:t>uvek</w:t>
+      </w:r>
+      <w:proofErr w:type="spellEnd"/>
+      <w:r>
+        <w:rPr>
+          <w:color w:val="000000"/>
+          <w:sz w:val="24"/>
+          <w:szCs w:val="24"/>
+        </w:rPr>
+        <w:t xml:space="preserve"> </w:t>
+      </w:r>
+      <w:proofErr w:type="spellStart"/>
+      <w:r>
+        <w:rPr>
+          <w:color w:val="000000"/>
+          <w:sz w:val="24"/>
+          <w:szCs w:val="24"/>
+        </w:rPr>
+        <w:t>nije</w:t>
+      </w:r>
+      <w:proofErr w:type="spellEnd"/>
+      <w:r>
+        <w:rPr>
+          <w:color w:val="000000"/>
+          <w:sz w:val="24"/>
+          <w:szCs w:val="24"/>
+        </w:rPr>
+        <w:t xml:space="preserve"> </w:t>
+      </w:r>
+      <w:proofErr w:type="spellStart"/>
+      <w:r>
+        <w:rPr>
+          <w:color w:val="000000"/>
+          <w:sz w:val="24"/>
+          <w:szCs w:val="24"/>
+        </w:rPr>
+        <w:t>poznat</w:t>
+      </w:r>
+      <w:proofErr w:type="spellEnd"/>
+      <w:r>
+        <w:rPr>
+          <w:color w:val="000000"/>
+          <w:sz w:val="24"/>
+          <w:szCs w:val="24"/>
+        </w:rPr>
+        <w:t xml:space="preserve"> (</w:t>
+      </w:r>
+      <w:proofErr w:type="spellStart"/>
+      <w:r>
+        <w:rPr>
+          <w:color w:val="000000"/>
+          <w:sz w:val="24"/>
+          <w:szCs w:val="24"/>
+        </w:rPr>
+        <w:t>varijante</w:t>
+      </w:r>
+      <w:proofErr w:type="spellEnd"/>
+      <w:r>
+        <w:rPr>
+          <w:color w:val="000000"/>
+          <w:sz w:val="24"/>
+          <w:szCs w:val="24"/>
+        </w:rPr>
+        <w:t xml:space="preserve"> </w:t>
+      </w:r>
+      <w:proofErr w:type="spellStart"/>
+      <w:r>
+        <w:rPr>
+          <w:color w:val="000000"/>
+          <w:sz w:val="24"/>
+          <w:szCs w:val="24"/>
+        </w:rPr>
+        <w:t>neodređenog</w:t>
+      </w:r>
+      <w:proofErr w:type="spellEnd"/>
+      <w:r>
+        <w:rPr>
+          <w:color w:val="000000"/>
+          <w:sz w:val="24"/>
+          <w:szCs w:val="24"/>
+        </w:rPr>
+        <w:t xml:space="preserve"> </w:t>
+      </w:r>
+      <w:proofErr w:type="spellStart"/>
+      <w:r>
+        <w:rPr>
+          <w:color w:val="000000"/>
+          <w:sz w:val="24"/>
+          <w:szCs w:val="24"/>
+        </w:rPr>
+        <w:t>značaja</w:t>
+      </w:r>
+      <w:proofErr w:type="spellEnd"/>
+      <w:r>
+        <w:rPr>
+          <w:color w:val="000000"/>
+          <w:sz w:val="24"/>
+          <w:szCs w:val="24"/>
+        </w:rPr>
+        <w:t xml:space="preserve">). U </w:t>
+      </w:r>
+      <w:proofErr w:type="spellStart"/>
+      <w:r>
+        <w:rPr>
+          <w:color w:val="000000"/>
+          <w:sz w:val="24"/>
+          <w:szCs w:val="24"/>
+        </w:rPr>
+        <w:t>slučaju</w:t>
+      </w:r>
+      <w:proofErr w:type="spellEnd"/>
+      <w:r>
+        <w:rPr>
+          <w:color w:val="000000"/>
+          <w:sz w:val="24"/>
+          <w:szCs w:val="24"/>
+        </w:rPr>
+        <w:t xml:space="preserve"> </w:t>
+      </w:r>
+      <w:proofErr w:type="spellStart"/>
+      <w:r>
+        <w:rPr>
+          <w:color w:val="000000"/>
+          <w:sz w:val="24"/>
+          <w:szCs w:val="24"/>
+        </w:rPr>
+        <w:t>prenatalne</w:t>
+      </w:r>
+      <w:proofErr w:type="spellEnd"/>
+      <w:r>
+        <w:rPr>
+          <w:color w:val="000000"/>
+          <w:sz w:val="24"/>
+          <w:szCs w:val="24"/>
+        </w:rPr>
+        <w:t xml:space="preserve"> </w:t>
+      </w:r>
+      <w:proofErr w:type="spellStart"/>
+      <w:r>
+        <w:rPr>
+          <w:color w:val="000000"/>
+          <w:sz w:val="24"/>
+          <w:szCs w:val="24"/>
+        </w:rPr>
+        <w:t>dijagnostike</w:t>
+      </w:r>
+      <w:proofErr w:type="spellEnd"/>
+      <w:r>
+        <w:rPr>
+          <w:color w:val="000000"/>
+          <w:sz w:val="24"/>
+          <w:szCs w:val="24"/>
+        </w:rPr>
+        <w:t xml:space="preserve"> </w:t>
+      </w:r>
+      <w:proofErr w:type="spellStart"/>
+      <w:r>
+        <w:rPr>
+          <w:color w:val="000000"/>
+          <w:sz w:val="24"/>
+          <w:szCs w:val="24"/>
+        </w:rPr>
+        <w:t>i</w:t>
+      </w:r>
+      <w:proofErr w:type="spellEnd"/>
+      <w:r>
+        <w:rPr>
+          <w:color w:val="000000"/>
+          <w:sz w:val="24"/>
+          <w:szCs w:val="24"/>
+        </w:rPr>
+        <w:t xml:space="preserve"> u </w:t>
+      </w:r>
+      <w:proofErr w:type="spellStart"/>
+      <w:r>
+        <w:rPr>
+          <w:color w:val="000000"/>
+          <w:sz w:val="24"/>
+          <w:szCs w:val="24"/>
+        </w:rPr>
+        <w:t>slučaju</w:t>
+      </w:r>
+      <w:proofErr w:type="spellEnd"/>
+      <w:r>
+        <w:rPr>
+          <w:color w:val="000000"/>
+          <w:sz w:val="24"/>
+          <w:szCs w:val="24"/>
+        </w:rPr>
+        <w:t xml:space="preserve"> </w:t>
+      </w:r>
+      <w:proofErr w:type="spellStart"/>
+      <w:r>
+        <w:rPr>
+          <w:color w:val="000000"/>
+          <w:sz w:val="24"/>
+          <w:szCs w:val="24"/>
+        </w:rPr>
+        <w:t>analize</w:t>
+      </w:r>
+      <w:proofErr w:type="spellEnd"/>
+      <w:r>
+        <w:rPr>
+          <w:color w:val="000000"/>
+          <w:sz w:val="24"/>
+          <w:szCs w:val="24"/>
+        </w:rPr>
+        <w:t xml:space="preserve"> </w:t>
+      </w:r>
+      <w:proofErr w:type="spellStart"/>
+      <w:r>
+        <w:rPr>
+          <w:color w:val="000000"/>
+          <w:sz w:val="24"/>
+          <w:szCs w:val="24"/>
+        </w:rPr>
+        <w:t>uzorka</w:t>
+      </w:r>
+      <w:proofErr w:type="spellEnd"/>
+      <w:r>
+        <w:rPr>
+          <w:color w:val="000000"/>
+          <w:sz w:val="24"/>
+          <w:szCs w:val="24"/>
+        </w:rPr>
+        <w:t xml:space="preserve"> </w:t>
+      </w:r>
+      <w:proofErr w:type="spellStart"/>
+      <w:r>
+        <w:rPr>
+          <w:color w:val="000000"/>
+          <w:sz w:val="24"/>
+          <w:szCs w:val="24"/>
+        </w:rPr>
+        <w:t>tumorskog</w:t>
+      </w:r>
+      <w:proofErr w:type="spellEnd"/>
+      <w:r>
+        <w:rPr>
+          <w:color w:val="000000"/>
+          <w:sz w:val="24"/>
+          <w:szCs w:val="24"/>
+        </w:rPr>
+        <w:t xml:space="preserve"> </w:t>
+      </w:r>
+      <w:proofErr w:type="spellStart"/>
+      <w:r>
+        <w:rPr>
+          <w:color w:val="000000"/>
+          <w:sz w:val="24"/>
+          <w:szCs w:val="24"/>
+        </w:rPr>
+        <w:t>tkiva</w:t>
       </w:r>
       <w:proofErr w:type="spellEnd"/>
       <w:r>
@@ -19355,151 +20010,133 @@
           <w:sz w:val="24"/>
           <w:szCs w:val="24"/>
         </w:rPr>
-        <w:t>Instituta</w:t>
-      </w:r>
-      <w:proofErr w:type="spellEnd"/>
-      <w:r>
-        <w:rPr>
-          <w:color w:val="000000"/>
-          <w:sz w:val="24"/>
-          <w:szCs w:val="24"/>
-        </w:rPr>
-        <w:t xml:space="preserve"> </w:t>
-      </w:r>
-      <w:proofErr w:type="spellStart"/>
-      <w:r>
-        <w:rPr>
-          <w:color w:val="000000"/>
-          <w:sz w:val="24"/>
-          <w:szCs w:val="24"/>
-        </w:rPr>
-        <w:t>za</w:t>
-      </w:r>
-      <w:proofErr w:type="spellEnd"/>
-      <w:r>
-        <w:rPr>
-          <w:color w:val="000000"/>
-          <w:sz w:val="24"/>
-          <w:szCs w:val="24"/>
-        </w:rPr>
-        <w:t xml:space="preserve"> </w:t>
-      </w:r>
-      <w:proofErr w:type="spellStart"/>
-      <w:r>
-        <w:rPr>
-          <w:color w:val="000000"/>
-          <w:sz w:val="24"/>
-          <w:szCs w:val="24"/>
-        </w:rPr>
-        <w:t>molekularnu</w:t>
-      </w:r>
-      <w:proofErr w:type="spellEnd"/>
-      <w:r>
-        <w:rPr>
-          <w:color w:val="000000"/>
-          <w:sz w:val="24"/>
-          <w:szCs w:val="24"/>
-        </w:rPr>
-        <w:t xml:space="preserve"> </w:t>
-      </w:r>
-      <w:proofErr w:type="spellStart"/>
-      <w:r>
-        <w:rPr>
-          <w:color w:val="000000"/>
-          <w:sz w:val="24"/>
-          <w:szCs w:val="24"/>
-        </w:rPr>
-        <w:t>genetiku</w:t>
-      </w:r>
-      <w:proofErr w:type="spellEnd"/>
-      <w:r>
-        <w:rPr>
-          <w:color w:val="000000"/>
-          <w:sz w:val="24"/>
-          <w:szCs w:val="24"/>
-        </w:rPr>
-        <w:t xml:space="preserve"> </w:t>
-      </w:r>
-      <w:proofErr w:type="spellStart"/>
-      <w:r>
-        <w:rPr>
-          <w:color w:val="000000"/>
-          <w:sz w:val="24"/>
-          <w:szCs w:val="24"/>
-        </w:rPr>
-        <w:t>i</w:t>
-      </w:r>
-      <w:proofErr w:type="spellEnd"/>
-      <w:r>
-        <w:rPr>
-          <w:color w:val="000000"/>
-          <w:sz w:val="24"/>
-          <w:szCs w:val="24"/>
-        </w:rPr>
-        <w:t xml:space="preserve"> </w:t>
-      </w:r>
-      <w:proofErr w:type="spellStart"/>
-      <w:r>
-        <w:rPr>
-          <w:color w:val="000000"/>
-          <w:sz w:val="24"/>
-          <w:szCs w:val="24"/>
-        </w:rPr>
-        <w:t>genetičko</w:t>
-      </w:r>
-      <w:proofErr w:type="spellEnd"/>
-      <w:r>
-        <w:rPr>
-          <w:color w:val="000000"/>
-          <w:sz w:val="24"/>
-          <w:szCs w:val="24"/>
-        </w:rPr>
-        <w:t xml:space="preserve"> </w:t>
-      </w:r>
-      <w:proofErr w:type="spellStart"/>
-      <w:r>
-        <w:rPr>
-          <w:color w:val="000000"/>
-          <w:sz w:val="24"/>
-          <w:szCs w:val="24"/>
-        </w:rPr>
-        <w:t>inženjerstvo</w:t>
-      </w:r>
-      <w:proofErr w:type="spellEnd"/>
-      <w:r>
-        <w:rPr>
-          <w:color w:val="000000"/>
-          <w:sz w:val="24"/>
-          <w:szCs w:val="24"/>
-        </w:rPr>
-        <w:t xml:space="preserve"> </w:t>
-      </w:r>
-      <w:proofErr w:type="spellStart"/>
-      <w:r>
-        <w:rPr>
-          <w:color w:val="000000"/>
-          <w:sz w:val="24"/>
-          <w:szCs w:val="24"/>
-        </w:rPr>
-        <w:t>Univerziteta</w:t>
-      </w:r>
-      <w:proofErr w:type="spellEnd"/>
-      <w:r>
-        <w:rPr>
-          <w:color w:val="000000"/>
-          <w:sz w:val="24"/>
-          <w:szCs w:val="24"/>
-        </w:rPr>
-        <w:t xml:space="preserve"> u </w:t>
-      </w:r>
-      <w:proofErr w:type="spellStart"/>
-      <w:r>
-        <w:rPr>
-          <w:color w:val="000000"/>
-          <w:sz w:val="24"/>
-          <w:szCs w:val="24"/>
-        </w:rPr>
-        <w:t>Beogradu</w:t>
+        <w:t>postoji</w:t>
+      </w:r>
+      <w:proofErr w:type="spellEnd"/>
+      <w:r>
+        <w:rPr>
+          <w:color w:val="000000"/>
+          <w:sz w:val="24"/>
+          <w:szCs w:val="24"/>
+        </w:rPr>
+        <w:t xml:space="preserve"> </w:t>
+      </w:r>
+      <w:proofErr w:type="spellStart"/>
+      <w:r>
+        <w:rPr>
+          <w:color w:val="000000"/>
+          <w:sz w:val="24"/>
+          <w:szCs w:val="24"/>
+        </w:rPr>
+        <w:t>mogućnost</w:t>
+      </w:r>
+      <w:proofErr w:type="spellEnd"/>
+      <w:r>
+        <w:rPr>
+          <w:color w:val="000000"/>
+          <w:sz w:val="24"/>
+          <w:szCs w:val="24"/>
+        </w:rPr>
+        <w:t xml:space="preserve"> da </w:t>
+      </w:r>
+      <w:proofErr w:type="spellStart"/>
+      <w:r>
+        <w:rPr>
+          <w:color w:val="000000"/>
+          <w:sz w:val="24"/>
+          <w:szCs w:val="24"/>
+        </w:rPr>
+        <w:t>analiza</w:t>
+      </w:r>
+      <w:proofErr w:type="spellEnd"/>
+      <w:r>
+        <w:rPr>
+          <w:color w:val="000000"/>
+          <w:sz w:val="24"/>
+          <w:szCs w:val="24"/>
+        </w:rPr>
+        <w:t xml:space="preserve"> ne </w:t>
+      </w:r>
+      <w:proofErr w:type="spellStart"/>
+      <w:r>
+        <w:rPr>
+          <w:color w:val="000000"/>
+          <w:sz w:val="24"/>
+          <w:szCs w:val="24"/>
+        </w:rPr>
+        <w:t>uspe</w:t>
+      </w:r>
+      <w:proofErr w:type="spellEnd"/>
+      <w:r>
+        <w:rPr>
+          <w:color w:val="000000"/>
+          <w:sz w:val="24"/>
+          <w:szCs w:val="24"/>
+        </w:rPr>
+        <w:t xml:space="preserve">, </w:t>
+      </w:r>
+      <w:proofErr w:type="spellStart"/>
+      <w:r>
+        <w:rPr>
+          <w:color w:val="000000"/>
+          <w:sz w:val="24"/>
+          <w:szCs w:val="24"/>
+        </w:rPr>
+        <w:t>odnosno</w:t>
+      </w:r>
+      <w:proofErr w:type="spellEnd"/>
+      <w:r>
+        <w:rPr>
+          <w:color w:val="000000"/>
+          <w:sz w:val="24"/>
+          <w:szCs w:val="24"/>
+        </w:rPr>
+        <w:t xml:space="preserve"> da </w:t>
+      </w:r>
+      <w:proofErr w:type="spellStart"/>
+      <w:r>
+        <w:rPr>
+          <w:color w:val="000000"/>
+          <w:sz w:val="24"/>
+          <w:szCs w:val="24"/>
+        </w:rPr>
+        <w:t>iz</w:t>
+      </w:r>
+      <w:proofErr w:type="spellEnd"/>
+      <w:r>
+        <w:rPr>
+          <w:color w:val="000000"/>
+          <w:sz w:val="24"/>
+          <w:szCs w:val="24"/>
+        </w:rPr>
+        <w:t xml:space="preserve"> </w:t>
+      </w:r>
+      <w:proofErr w:type="spellStart"/>
+      <w:r>
+        <w:rPr>
+          <w:color w:val="000000"/>
+          <w:sz w:val="24"/>
+          <w:szCs w:val="24"/>
+        </w:rPr>
+        <w:t>datog</w:t>
+      </w:r>
+      <w:proofErr w:type="spellEnd"/>
+      <w:r>
+        <w:rPr>
+          <w:color w:val="000000"/>
+          <w:sz w:val="24"/>
+          <w:szCs w:val="24"/>
+        </w:rPr>
+        <w:t xml:space="preserve"> </w:t>
+      </w:r>
+      <w:proofErr w:type="spellStart"/>
+      <w:r>
+        <w:rPr>
+          <w:color w:val="000000"/>
+          <w:sz w:val="24"/>
+          <w:szCs w:val="24"/>
+        </w:rPr>
+        <w:t>uzorka</w:t>
       </w:r>
       <w:proofErr w:type="spellEnd"/>
       <w:r>
@@ -19535,322 +20172,88 @@
           <w:sz w:val="24"/>
           <w:szCs w:val="24"/>
         </w:rPr>
-        <w:t>odgovorna</w:t>
-      </w:r>
-      <w:proofErr w:type="spellEnd"/>
-      <w:r>
-        <w:rPr>
-          <w:color w:val="000000"/>
-          <w:sz w:val="24"/>
-          <w:szCs w:val="24"/>
-        </w:rPr>
-        <w:t xml:space="preserve"> </w:t>
-      </w:r>
-      <w:proofErr w:type="spellStart"/>
-      <w:r>
-        <w:rPr>
-          <w:color w:val="000000"/>
-          <w:sz w:val="24"/>
-          <w:szCs w:val="24"/>
-        </w:rPr>
-        <w:t>za</w:t>
-      </w:r>
-      <w:proofErr w:type="spellEnd"/>
-      <w:r>
-        <w:rPr>
-          <w:color w:val="000000"/>
-          <w:sz w:val="24"/>
-          <w:szCs w:val="24"/>
-        </w:rPr>
-        <w:t xml:space="preserve"> </w:t>
-      </w:r>
-      <w:proofErr w:type="spellStart"/>
-      <w:r>
-        <w:rPr>
-          <w:color w:val="000000"/>
-          <w:sz w:val="24"/>
-          <w:szCs w:val="24"/>
-        </w:rPr>
-        <w:t>primenu</w:t>
-      </w:r>
-      <w:proofErr w:type="spellEnd"/>
-      <w:r>
-        <w:rPr>
-          <w:color w:val="000000"/>
-          <w:sz w:val="24"/>
-          <w:szCs w:val="24"/>
-        </w:rPr>
-        <w:t xml:space="preserve"> </w:t>
-      </w:r>
-      <w:proofErr w:type="spellStart"/>
-      <w:r>
-        <w:rPr>
-          <w:color w:val="000000"/>
-          <w:sz w:val="24"/>
-          <w:szCs w:val="24"/>
-        </w:rPr>
-        <w:t>rezultata</w:t>
-      </w:r>
-      <w:proofErr w:type="spellEnd"/>
-      <w:r>
-        <w:rPr>
-          <w:color w:val="000000"/>
-          <w:sz w:val="24"/>
-          <w:szCs w:val="24"/>
-        </w:rPr>
-        <w:t xml:space="preserve"> </w:t>
-      </w:r>
-      <w:proofErr w:type="spellStart"/>
-      <w:r>
-        <w:rPr>
-          <w:color w:val="000000"/>
-          <w:sz w:val="24"/>
-          <w:szCs w:val="24"/>
-        </w:rPr>
-        <w:t>ove</w:t>
-      </w:r>
-      <w:proofErr w:type="spellEnd"/>
-      <w:r>
-        <w:rPr>
-          <w:color w:val="000000"/>
-          <w:sz w:val="24"/>
-          <w:szCs w:val="24"/>
-        </w:rPr>
-        <w:t xml:space="preserve"> </w:t>
-      </w:r>
-      <w:proofErr w:type="spellStart"/>
-      <w:r>
-        <w:rPr>
-          <w:color w:val="000000"/>
-          <w:sz w:val="24"/>
-          <w:szCs w:val="24"/>
-        </w:rPr>
-        <w:t>analize</w:t>
-      </w:r>
-      <w:proofErr w:type="spellEnd"/>
-      <w:r>
-        <w:rPr>
-          <w:color w:val="000000"/>
-          <w:sz w:val="24"/>
-          <w:szCs w:val="24"/>
-        </w:rPr>
-        <w:t xml:space="preserve">, </w:t>
-      </w:r>
-      <w:proofErr w:type="spellStart"/>
-      <w:r>
-        <w:rPr>
-          <w:color w:val="000000"/>
-          <w:sz w:val="24"/>
-          <w:szCs w:val="24"/>
-        </w:rPr>
-        <w:t>niti</w:t>
-      </w:r>
-      <w:proofErr w:type="spellEnd"/>
-      <w:r>
-        <w:rPr>
-          <w:color w:val="000000"/>
-          <w:sz w:val="24"/>
-          <w:szCs w:val="24"/>
-        </w:rPr>
-        <w:t xml:space="preserve"> </w:t>
-      </w:r>
-      <w:proofErr w:type="spellStart"/>
-      <w:r>
-        <w:rPr>
-          <w:color w:val="000000"/>
-          <w:sz w:val="24"/>
-          <w:szCs w:val="24"/>
-        </w:rPr>
-        <w:t>za</w:t>
-      </w:r>
-      <w:proofErr w:type="spellEnd"/>
-      <w:r>
-        <w:rPr>
-          <w:color w:val="000000"/>
-          <w:sz w:val="24"/>
-          <w:szCs w:val="24"/>
-        </w:rPr>
-        <w:t xml:space="preserve"> </w:t>
-      </w:r>
-      <w:proofErr w:type="spellStart"/>
-      <w:r>
-        <w:rPr>
-          <w:color w:val="000000"/>
-          <w:sz w:val="24"/>
-          <w:szCs w:val="24"/>
-        </w:rPr>
-        <w:t>bilo</w:t>
-      </w:r>
-      <w:proofErr w:type="spellEnd"/>
-      <w:r>
-        <w:rPr>
-          <w:color w:val="000000"/>
-          <w:sz w:val="24"/>
-          <w:szCs w:val="24"/>
-        </w:rPr>
-        <w:t xml:space="preserve"> </w:t>
-      </w:r>
-      <w:proofErr w:type="spellStart"/>
-      <w:r>
-        <w:rPr>
-          <w:color w:val="000000"/>
-          <w:sz w:val="24"/>
-          <w:szCs w:val="24"/>
-        </w:rPr>
-        <w:t>kakve</w:t>
-      </w:r>
-      <w:proofErr w:type="spellEnd"/>
-      <w:r>
-        <w:rPr>
-          <w:color w:val="000000"/>
-          <w:sz w:val="24"/>
-          <w:szCs w:val="24"/>
-        </w:rPr>
-        <w:t xml:space="preserve"> </w:t>
-      </w:r>
-      <w:proofErr w:type="spellStart"/>
-      <w:r>
-        <w:rPr>
-          <w:color w:val="000000"/>
-          <w:sz w:val="24"/>
-          <w:szCs w:val="24"/>
-        </w:rPr>
-        <w:t>neželjene</w:t>
-      </w:r>
-      <w:proofErr w:type="spellEnd"/>
-      <w:r>
-        <w:rPr>
-          <w:color w:val="000000"/>
-          <w:sz w:val="24"/>
-          <w:szCs w:val="24"/>
-        </w:rPr>
-        <w:t xml:space="preserve"> </w:t>
-      </w:r>
-      <w:proofErr w:type="spellStart"/>
-      <w:r>
-        <w:rPr>
-          <w:color w:val="000000"/>
-          <w:sz w:val="24"/>
-          <w:szCs w:val="24"/>
-        </w:rPr>
-        <w:t>posledice</w:t>
-      </w:r>
-      <w:proofErr w:type="spellEnd"/>
-      <w:r>
-        <w:rPr>
-          <w:color w:val="000000"/>
-          <w:sz w:val="24"/>
-          <w:szCs w:val="24"/>
-        </w:rPr>
-        <w:t xml:space="preserve"> </w:t>
-      </w:r>
-      <w:proofErr w:type="spellStart"/>
-      <w:r>
-        <w:rPr>
-          <w:color w:val="000000"/>
-          <w:sz w:val="24"/>
-          <w:szCs w:val="24"/>
-        </w:rPr>
-        <w:t>koje</w:t>
-      </w:r>
-      <w:proofErr w:type="spellEnd"/>
-      <w:r>
-        <w:rPr>
-          <w:color w:val="000000"/>
-          <w:sz w:val="24"/>
-          <w:szCs w:val="24"/>
-        </w:rPr>
-        <w:t xml:space="preserve"> </w:t>
-      </w:r>
-      <w:proofErr w:type="spellStart"/>
-      <w:r>
-        <w:rPr>
-          <w:color w:val="000000"/>
-          <w:sz w:val="24"/>
-          <w:szCs w:val="24"/>
-        </w:rPr>
-        <w:t>iz</w:t>
-      </w:r>
-      <w:proofErr w:type="spellEnd"/>
-      <w:r>
-        <w:rPr>
-          <w:color w:val="000000"/>
-          <w:sz w:val="24"/>
-          <w:szCs w:val="24"/>
-        </w:rPr>
-        <w:t xml:space="preserve"> </w:t>
-      </w:r>
-      <w:proofErr w:type="spellStart"/>
-      <w:r>
-        <w:rPr>
-          <w:color w:val="000000"/>
-          <w:sz w:val="24"/>
-          <w:szCs w:val="24"/>
-        </w:rPr>
-        <w:t>takve</w:t>
-      </w:r>
-      <w:proofErr w:type="spellEnd"/>
-      <w:r>
-        <w:rPr>
-          <w:color w:val="000000"/>
-          <w:sz w:val="24"/>
-          <w:szCs w:val="24"/>
-        </w:rPr>
-        <w:t xml:space="preserve"> </w:t>
-      </w:r>
-      <w:proofErr w:type="spellStart"/>
-      <w:r>
-        <w:rPr>
-          <w:color w:val="000000"/>
-          <w:sz w:val="24"/>
-          <w:szCs w:val="24"/>
-        </w:rPr>
-        <w:t>primene</w:t>
-      </w:r>
-      <w:proofErr w:type="spellEnd"/>
-      <w:r>
-        <w:rPr>
-          <w:color w:val="000000"/>
-          <w:sz w:val="24"/>
-          <w:szCs w:val="24"/>
-        </w:rPr>
-        <w:t xml:space="preserve"> </w:t>
-      </w:r>
-      <w:proofErr w:type="spellStart"/>
-      <w:r>
-        <w:rPr>
-          <w:color w:val="000000"/>
-          <w:sz w:val="24"/>
-          <w:szCs w:val="24"/>
-        </w:rPr>
-        <w:t>mogu</w:t>
-      </w:r>
-      <w:proofErr w:type="spellEnd"/>
-      <w:r>
-        <w:rPr>
-          <w:color w:val="000000"/>
-          <w:sz w:val="24"/>
-          <w:szCs w:val="24"/>
-        </w:rPr>
-        <w:t xml:space="preserve"> </w:t>
-      </w:r>
-      <w:proofErr w:type="spellStart"/>
-      <w:r>
-        <w:rPr>
-          <w:color w:val="000000"/>
-          <w:sz w:val="24"/>
-          <w:szCs w:val="24"/>
-        </w:rPr>
-        <w:t>proisteći</w:t>
-      </w:r>
-      <w:proofErr w:type="spellEnd"/>
-      <w:r>
-        <w:rPr>
-          <w:color w:val="000000"/>
-          <w:sz w:val="24"/>
-          <w:szCs w:val="24"/>
-        </w:rPr>
-        <w:t>.</w:t>
+        <w:t>moguće</w:t>
+      </w:r>
+      <w:proofErr w:type="spellEnd"/>
+      <w:r>
+        <w:rPr>
+          <w:color w:val="000000"/>
+          <w:sz w:val="24"/>
+          <w:szCs w:val="24"/>
+        </w:rPr>
+        <w:t xml:space="preserve"> </w:t>
+      </w:r>
+      <w:proofErr w:type="spellStart"/>
+      <w:r>
+        <w:rPr>
+          <w:color w:val="000000"/>
+          <w:sz w:val="24"/>
+          <w:szCs w:val="24"/>
+        </w:rPr>
+        <w:t>dobiti</w:t>
+      </w:r>
+      <w:proofErr w:type="spellEnd"/>
+      <w:r>
+        <w:rPr>
+          <w:color w:val="000000"/>
+          <w:sz w:val="24"/>
+          <w:szCs w:val="24"/>
+        </w:rPr>
+        <w:t xml:space="preserve"> DNK </w:t>
+      </w:r>
+      <w:proofErr w:type="spellStart"/>
+      <w:r>
+        <w:rPr>
+          <w:color w:val="000000"/>
+          <w:sz w:val="24"/>
+          <w:szCs w:val="24"/>
+        </w:rPr>
+        <w:t>dovoljno</w:t>
+      </w:r>
+      <w:proofErr w:type="spellEnd"/>
+      <w:r>
+        <w:rPr>
+          <w:color w:val="000000"/>
+          <w:sz w:val="24"/>
+          <w:szCs w:val="24"/>
+        </w:rPr>
+        <w:t xml:space="preserve"> </w:t>
+      </w:r>
+      <w:proofErr w:type="spellStart"/>
+      <w:r>
+        <w:rPr>
+          <w:color w:val="000000"/>
+          <w:sz w:val="24"/>
+          <w:szCs w:val="24"/>
+        </w:rPr>
+        <w:t>dobrog</w:t>
+      </w:r>
+      <w:proofErr w:type="spellEnd"/>
+      <w:r>
+        <w:rPr>
+          <w:color w:val="000000"/>
+          <w:sz w:val="24"/>
+          <w:szCs w:val="24"/>
+        </w:rPr>
+        <w:t xml:space="preserve"> </w:t>
+      </w:r>
+      <w:proofErr w:type="spellStart"/>
+      <w:r>
+        <w:rPr>
+          <w:color w:val="000000"/>
+          <w:sz w:val="24"/>
+          <w:szCs w:val="24"/>
+        </w:rPr>
+        <w:t>kvaliteta</w:t>
+      </w:r>
+      <w:proofErr w:type="spellEnd"/>
+      <w:r>
+        <w:rPr>
+          <w:color w:val="000000"/>
+          <w:sz w:val="24"/>
+          <w:szCs w:val="24"/>
+        </w:rPr>
+        <w:t xml:space="preserve">. </w:t>
       </w:r>
     </w:p>
     <w:p>
@@ -19860,19 +20263,586 @@
         <w:rPr>
           <w:b/>
           <w:bCs/>
+          <w:color w:val="000000"/>
           <w:sz w:val="24"/>
           <w:szCs w:val="24"/>
         </w:rPr>
       </w:pPr>
-      <w:r>
-        <w:rPr>
-          <w:b/>
-          <w:bCs/>
-          <w:color w:val="000000"/>
-          <w:sz w:val="24"/>
-          <w:szCs w:val="24"/>
-        </w:rPr>
-        <w:t>LITERATURA</w:t>
+      <w:proofErr w:type="spellStart"/>
+      <w:r>
+        <w:rPr>
+          <w:color w:val="000000"/>
+          <w:sz w:val="24"/>
+          <w:szCs w:val="24"/>
+        </w:rPr>
+        <w:t>Laboratorija</w:t>
+      </w:r>
+      <w:proofErr w:type="spellEnd"/>
+      <w:r>
+        <w:rPr>
+          <w:color w:val="000000"/>
+          <w:sz w:val="24"/>
+          <w:szCs w:val="24"/>
+        </w:rPr>
+        <w:t xml:space="preserve"> </w:t>
+      </w:r>
+      <w:proofErr w:type="spellStart"/>
+      <w:r>
+        <w:rPr>
+          <w:color w:val="000000"/>
+          <w:sz w:val="24"/>
+          <w:szCs w:val="24"/>
+        </w:rPr>
+        <w:t>za</w:t>
+      </w:r>
+      <w:proofErr w:type="spellEnd"/>
+      <w:r>
+        <w:rPr>
+          <w:color w:val="000000"/>
+          <w:sz w:val="24"/>
+          <w:szCs w:val="24"/>
+        </w:rPr>
+        <w:t xml:space="preserve"> </w:t>
+      </w:r>
+      <w:proofErr w:type="spellStart"/>
+      <w:r>
+        <w:rPr>
+          <w:color w:val="000000"/>
+          <w:sz w:val="24"/>
+          <w:szCs w:val="24"/>
+        </w:rPr>
+        <w:t>molekularnu</w:t>
+      </w:r>
+      <w:proofErr w:type="spellEnd"/>
+      <w:r>
+        <w:rPr>
+          <w:color w:val="000000"/>
+          <w:sz w:val="24"/>
+          <w:szCs w:val="24"/>
+        </w:rPr>
+        <w:t xml:space="preserve"> </w:t>
+      </w:r>
+      <w:proofErr w:type="spellStart"/>
+      <w:r>
+        <w:rPr>
+          <w:color w:val="000000"/>
+          <w:sz w:val="24"/>
+          <w:szCs w:val="24"/>
+        </w:rPr>
+        <w:t>biomedicinu</w:t>
+      </w:r>
+      <w:proofErr w:type="spellEnd"/>
+      <w:r>
+        <w:rPr>
+          <w:color w:val="000000"/>
+          <w:sz w:val="24"/>
+          <w:szCs w:val="24"/>
+        </w:rPr>
+        <w:t xml:space="preserve">, </w:t>
+      </w:r>
+      <w:proofErr w:type="spellStart"/>
+      <w:r>
+        <w:rPr>
+          <w:color w:val="000000"/>
+          <w:sz w:val="24"/>
+          <w:szCs w:val="24"/>
+        </w:rPr>
+        <w:t>Instituta</w:t>
+      </w:r>
+      <w:proofErr w:type="spellEnd"/>
+      <w:r>
+        <w:rPr>
+          <w:color w:val="000000"/>
+          <w:sz w:val="24"/>
+          <w:szCs w:val="24"/>
+        </w:rPr>
+        <w:t xml:space="preserve"> </w:t>
+      </w:r>
+      <w:proofErr w:type="spellStart"/>
+      <w:r>
+        <w:rPr>
+          <w:color w:val="000000"/>
+          <w:sz w:val="24"/>
+          <w:szCs w:val="24"/>
+        </w:rPr>
+        <w:t>za</w:t>
+      </w:r>
+      <w:proofErr w:type="spellEnd"/>
+      <w:r>
+        <w:rPr>
+          <w:color w:val="000000"/>
+          <w:sz w:val="24"/>
+          <w:szCs w:val="24"/>
+        </w:rPr>
+        <w:t xml:space="preserve"> </w:t>
+      </w:r>
+      <w:proofErr w:type="spellStart"/>
+      <w:r>
+        <w:rPr>
+          <w:color w:val="000000"/>
+          <w:sz w:val="24"/>
+          <w:szCs w:val="24"/>
+        </w:rPr>
+        <w:t>molekularnu</w:t>
+      </w:r>
+      <w:proofErr w:type="spellEnd"/>
+      <w:r>
+        <w:rPr>
+          <w:color w:val="000000"/>
+          <w:sz w:val="24"/>
+          <w:szCs w:val="24"/>
+        </w:rPr>
+        <w:t xml:space="preserve"> </w:t>
+      </w:r>
+      <w:proofErr w:type="spellStart"/>
+      <w:r>
+        <w:rPr>
+          <w:color w:val="000000"/>
+          <w:sz w:val="24"/>
+          <w:szCs w:val="24"/>
+        </w:rPr>
+        <w:t>genetiku</w:t>
+      </w:r>
+      <w:proofErr w:type="spellEnd"/>
+      <w:r>
+        <w:rPr>
+          <w:color w:val="000000"/>
+          <w:sz w:val="24"/>
+          <w:szCs w:val="24"/>
+        </w:rPr>
+        <w:t xml:space="preserve"> </w:t>
+      </w:r>
+      <w:proofErr w:type="spellStart"/>
+      <w:r>
+        <w:rPr>
+          <w:color w:val="000000"/>
+          <w:sz w:val="24"/>
+          <w:szCs w:val="24"/>
+        </w:rPr>
+        <w:t>i</w:t>
+      </w:r>
+      <w:proofErr w:type="spellEnd"/>
+      <w:r>
+        <w:rPr>
+          <w:color w:val="000000"/>
+          <w:sz w:val="24"/>
+          <w:szCs w:val="24"/>
+        </w:rPr>
+        <w:t xml:space="preserve"> </w:t>
+      </w:r>
+      <w:proofErr w:type="spellStart"/>
+      <w:r>
+        <w:rPr>
+          <w:color w:val="000000"/>
+          <w:sz w:val="24"/>
+          <w:szCs w:val="24"/>
+        </w:rPr>
+        <w:t>genetičko</w:t>
+      </w:r>
+      <w:proofErr w:type="spellEnd"/>
+      <w:r>
+        <w:rPr>
+          <w:color w:val="000000"/>
+          <w:sz w:val="24"/>
+          <w:szCs w:val="24"/>
+        </w:rPr>
+        <w:t xml:space="preserve"> </w:t>
+      </w:r>
+      <w:proofErr w:type="spellStart"/>
+      <w:r>
+        <w:rPr>
+          <w:color w:val="000000"/>
+          <w:sz w:val="24"/>
+          <w:szCs w:val="24"/>
+        </w:rPr>
+        <w:t>inženjerstvo</w:t>
+      </w:r>
+      <w:proofErr w:type="spellEnd"/>
+      <w:r>
+        <w:rPr>
+          <w:color w:val="000000"/>
+          <w:sz w:val="24"/>
+          <w:szCs w:val="24"/>
+        </w:rPr>
+        <w:t xml:space="preserve"> </w:t>
+      </w:r>
+      <w:proofErr w:type="spellStart"/>
+      <w:r>
+        <w:rPr>
+          <w:color w:val="000000"/>
+          <w:sz w:val="24"/>
+          <w:szCs w:val="24"/>
+        </w:rPr>
+        <w:t>Univerziteta</w:t>
+      </w:r>
+      <w:proofErr w:type="spellEnd"/>
+      <w:r>
+        <w:rPr>
+          <w:color w:val="000000"/>
+          <w:sz w:val="24"/>
+          <w:szCs w:val="24"/>
+        </w:rPr>
+        <w:t xml:space="preserve"> u </w:t>
+      </w:r>
+      <w:proofErr w:type="spellStart"/>
+      <w:r>
+        <w:rPr>
+          <w:color w:val="000000"/>
+          <w:sz w:val="24"/>
+          <w:szCs w:val="24"/>
+        </w:rPr>
+        <w:t>Beogradu</w:t>
+      </w:r>
+      <w:proofErr w:type="spellEnd"/>
+      <w:r>
+        <w:rPr>
+          <w:color w:val="000000"/>
+          <w:sz w:val="24"/>
+          <w:szCs w:val="24"/>
+        </w:rPr>
+        <w:t xml:space="preserve"> </w:t>
+      </w:r>
+      <w:proofErr w:type="spellStart"/>
+      <w:r>
+        <w:rPr>
+          <w:color w:val="000000"/>
+          <w:sz w:val="24"/>
+          <w:szCs w:val="24"/>
+        </w:rPr>
+        <w:t>nije</w:t>
+      </w:r>
+      <w:proofErr w:type="spellEnd"/>
+      <w:r>
+        <w:rPr>
+          <w:color w:val="000000"/>
+          <w:sz w:val="24"/>
+          <w:szCs w:val="24"/>
+        </w:rPr>
+        <w:t xml:space="preserve"> </w:t>
+      </w:r>
+      <w:proofErr w:type="spellStart"/>
+      <w:r>
+        <w:rPr>
+          <w:color w:val="000000"/>
+          <w:sz w:val="24"/>
+          <w:szCs w:val="24"/>
+        </w:rPr>
+        <w:t>odgovorna</w:t>
+      </w:r>
+      <w:proofErr w:type="spellEnd"/>
+      <w:r>
+        <w:rPr>
+          <w:color w:val="000000"/>
+          <w:sz w:val="24"/>
+          <w:szCs w:val="24"/>
+        </w:rPr>
+        <w:t xml:space="preserve"> </w:t>
+      </w:r>
+      <w:proofErr w:type="spellStart"/>
+      <w:r>
+        <w:rPr>
+          <w:color w:val="000000"/>
+          <w:sz w:val="24"/>
+          <w:szCs w:val="24"/>
+        </w:rPr>
+        <w:t>za</w:t>
+      </w:r>
+      <w:proofErr w:type="spellEnd"/>
+      <w:r>
+        <w:rPr>
+          <w:color w:val="000000"/>
+          <w:sz w:val="24"/>
+          <w:szCs w:val="24"/>
+        </w:rPr>
+        <w:t xml:space="preserve"> </w:t>
+      </w:r>
+      <w:proofErr w:type="spellStart"/>
+      <w:r>
+        <w:rPr>
+          <w:color w:val="000000"/>
+          <w:sz w:val="24"/>
+          <w:szCs w:val="24"/>
+        </w:rPr>
+        <w:t>primenu</w:t>
+      </w:r>
+      <w:proofErr w:type="spellEnd"/>
+      <w:r>
+        <w:rPr>
+          <w:color w:val="000000"/>
+          <w:sz w:val="24"/>
+          <w:szCs w:val="24"/>
+        </w:rPr>
+        <w:t xml:space="preserve"> </w:t>
+      </w:r>
+      <w:proofErr w:type="spellStart"/>
+      <w:r>
+        <w:rPr>
+          <w:color w:val="000000"/>
+          <w:sz w:val="24"/>
+          <w:szCs w:val="24"/>
+        </w:rPr>
+        <w:t>rezultata</w:t>
+      </w:r>
+      <w:proofErr w:type="spellEnd"/>
+      <w:r>
+        <w:rPr>
+          <w:color w:val="000000"/>
+          <w:sz w:val="24"/>
+          <w:szCs w:val="24"/>
+        </w:rPr>
+        <w:t xml:space="preserve"> </w:t>
+      </w:r>
+      <w:proofErr w:type="spellStart"/>
+      <w:r>
+        <w:rPr>
+          <w:color w:val="000000"/>
+          <w:sz w:val="24"/>
+          <w:szCs w:val="24"/>
+        </w:rPr>
+        <w:t>ove</w:t>
+      </w:r>
+      <w:proofErr w:type="spellEnd"/>
+      <w:r>
+        <w:rPr>
+          <w:color w:val="000000"/>
+          <w:sz w:val="24"/>
+          <w:szCs w:val="24"/>
+        </w:rPr>
+        <w:t xml:space="preserve"> </w:t>
+      </w:r>
+      <w:proofErr w:type="spellStart"/>
+      <w:r>
+        <w:rPr>
+          <w:color w:val="000000"/>
+          <w:sz w:val="24"/>
+          <w:szCs w:val="24"/>
+        </w:rPr>
+        <w:t>analize</w:t>
+      </w:r>
+      <w:proofErr w:type="spellEnd"/>
+      <w:r>
+        <w:rPr>
+          <w:color w:val="000000"/>
+          <w:sz w:val="24"/>
+          <w:szCs w:val="24"/>
+        </w:rPr>
+        <w:t xml:space="preserve">, </w:t>
+      </w:r>
+      <w:proofErr w:type="spellStart"/>
+      <w:r>
+        <w:rPr>
+          <w:color w:val="000000"/>
+          <w:sz w:val="24"/>
+          <w:szCs w:val="24"/>
+        </w:rPr>
+        <w:t>niti</w:t>
+      </w:r>
+      <w:proofErr w:type="spellEnd"/>
+      <w:r>
+        <w:rPr>
+          <w:color w:val="000000"/>
+          <w:sz w:val="24"/>
+          <w:szCs w:val="24"/>
+        </w:rPr>
+        <w:t xml:space="preserve"> </w:t>
+      </w:r>
+      <w:proofErr w:type="spellStart"/>
+      <w:r>
+        <w:rPr>
+          <w:color w:val="000000"/>
+          <w:sz w:val="24"/>
+          <w:szCs w:val="24"/>
+        </w:rPr>
+        <w:t>za</w:t>
+      </w:r>
+      <w:proofErr w:type="spellEnd"/>
+      <w:r>
+        <w:rPr>
+          <w:color w:val="000000"/>
+          <w:sz w:val="24"/>
+          <w:szCs w:val="24"/>
+        </w:rPr>
+        <w:t xml:space="preserve"> </w:t>
+      </w:r>
+      <w:proofErr w:type="spellStart"/>
+      <w:r>
+        <w:rPr>
+          <w:color w:val="000000"/>
+          <w:sz w:val="24"/>
+          <w:szCs w:val="24"/>
+        </w:rPr>
+        <w:t>bilo</w:t>
+      </w:r>
+      <w:proofErr w:type="spellEnd"/>
+      <w:r>
+        <w:rPr>
+          <w:color w:val="000000"/>
+          <w:sz w:val="24"/>
+          <w:szCs w:val="24"/>
+        </w:rPr>
+        <w:t xml:space="preserve"> </w:t>
+      </w:r>
+      <w:proofErr w:type="spellStart"/>
+      <w:r>
+        <w:rPr>
+          <w:color w:val="000000"/>
+          <w:sz w:val="24"/>
+          <w:szCs w:val="24"/>
+        </w:rPr>
+        <w:t>kakve</w:t>
+      </w:r>
+      <w:proofErr w:type="spellEnd"/>
+      <w:r>
+        <w:rPr>
+          <w:color w:val="000000"/>
+          <w:sz w:val="24"/>
+          <w:szCs w:val="24"/>
+        </w:rPr>
+        <w:t xml:space="preserve"> </w:t>
+      </w:r>
+      <w:proofErr w:type="spellStart"/>
+      <w:r>
+        <w:rPr>
+          <w:color w:val="000000"/>
+          <w:sz w:val="24"/>
+          <w:szCs w:val="24"/>
+        </w:rPr>
+        <w:t>neželjene</w:t>
+      </w:r>
+      <w:proofErr w:type="spellEnd"/>
+      <w:r>
+        <w:rPr>
+          <w:color w:val="000000"/>
+          <w:sz w:val="24"/>
+          <w:szCs w:val="24"/>
+        </w:rPr>
+        <w:t xml:space="preserve"> </w:t>
+      </w:r>
+      <w:proofErr w:type="spellStart"/>
+      <w:r>
+        <w:rPr>
+          <w:color w:val="000000"/>
+          <w:sz w:val="24"/>
+          <w:szCs w:val="24"/>
+        </w:rPr>
+        <w:t>posledice</w:t>
+      </w:r>
+      <w:proofErr w:type="spellEnd"/>
+      <w:r>
+        <w:rPr>
+          <w:color w:val="000000"/>
+          <w:sz w:val="24"/>
+          <w:szCs w:val="24"/>
+        </w:rPr>
+        <w:t xml:space="preserve"> </w:t>
+      </w:r>
+      <w:proofErr w:type="spellStart"/>
+      <w:r>
+        <w:rPr>
+          <w:color w:val="000000"/>
+          <w:sz w:val="24"/>
+          <w:szCs w:val="24"/>
+        </w:rPr>
+        <w:t>koje</w:t>
+      </w:r>
+      <w:proofErr w:type="spellEnd"/>
+      <w:r>
+        <w:rPr>
+          <w:color w:val="000000"/>
+          <w:sz w:val="24"/>
+          <w:szCs w:val="24"/>
+        </w:rPr>
+        <w:t xml:space="preserve"> </w:t>
+      </w:r>
+      <w:proofErr w:type="spellStart"/>
+      <w:r>
+        <w:rPr>
+          <w:color w:val="000000"/>
+          <w:sz w:val="24"/>
+          <w:szCs w:val="24"/>
+        </w:rPr>
+        <w:t>iz</w:t>
+      </w:r>
+      <w:proofErr w:type="spellEnd"/>
+      <w:r>
+        <w:rPr>
+          <w:color w:val="000000"/>
+          <w:sz w:val="24"/>
+          <w:szCs w:val="24"/>
+        </w:rPr>
+        <w:t xml:space="preserve"> </w:t>
+      </w:r>
+      <w:proofErr w:type="spellStart"/>
+      <w:r>
+        <w:rPr>
+          <w:color w:val="000000"/>
+          <w:sz w:val="24"/>
+          <w:szCs w:val="24"/>
+        </w:rPr>
+        <w:t>takve</w:t>
+      </w:r>
+      <w:proofErr w:type="spellEnd"/>
+      <w:r>
+        <w:rPr>
+          <w:color w:val="000000"/>
+          <w:sz w:val="24"/>
+          <w:szCs w:val="24"/>
+        </w:rPr>
+        <w:t xml:space="preserve"> </w:t>
+      </w:r>
+      <w:proofErr w:type="spellStart"/>
+      <w:r>
+        <w:rPr>
+          <w:color w:val="000000"/>
+          <w:sz w:val="24"/>
+          <w:szCs w:val="24"/>
+        </w:rPr>
+        <w:t>primene</w:t>
+      </w:r>
+      <w:proofErr w:type="spellEnd"/>
+      <w:r>
+        <w:rPr>
+          <w:color w:val="000000"/>
+          <w:sz w:val="24"/>
+          <w:szCs w:val="24"/>
+        </w:rPr>
+        <w:t xml:space="preserve"> </w:t>
+      </w:r>
+      <w:proofErr w:type="spellStart"/>
+      <w:r>
+        <w:rPr>
+          <w:color w:val="000000"/>
+          <w:sz w:val="24"/>
+          <w:szCs w:val="24"/>
+        </w:rPr>
+        <w:t>mogu</w:t>
+      </w:r>
+      <w:proofErr w:type="spellEnd"/>
+      <w:r>
+        <w:rPr>
+          <w:color w:val="000000"/>
+          <w:sz w:val="24"/>
+          <w:szCs w:val="24"/>
+        </w:rPr>
+        <w:t xml:space="preserve"> </w:t>
+      </w:r>
+      <w:proofErr w:type="spellStart"/>
+      <w:r>
+        <w:rPr>
+          <w:color w:val="000000"/>
+          <w:sz w:val="24"/>
+          <w:szCs w:val="24"/>
+        </w:rPr>
+        <w:t>proisteći</w:t>
+      </w:r>
+      <w:proofErr w:type="spellEnd"/>
+      <w:r>
+        <w:rPr>
+          <w:color w:val="000000"/>
+          <w:sz w:val="24"/>
+          <w:szCs w:val="24"/>
+        </w:rPr>
+        <w:t>.</w:t>
       </w:r>
     </w:p>
     <w:p>
@@ -19880,32 +20850,21 @@
         <w:spacing w:after="200" w:line="240" w:lineRule="auto"/>
         <w:jc w:val="both"/>
         <w:rPr>
+          <w:b/>
+          <w:bCs/>
           <w:sz w:val="24"/>
           <w:szCs w:val="24"/>
         </w:rPr>
       </w:pPr>
       <w:r>
         <w:rPr>
-          <w:sz w:val="24"/>
-          <w:szCs w:val="24"/>
-        </w:rPr>
-        <w:t xml:space="preserve">{%p for ref in </w:t>
-      </w:r>
-      <w:proofErr w:type="spellStart"/>
-      <w:r>
-        <w:rPr>
-          <w:sz w:val="24"/>
-          <w:szCs w:val="24"/>
-        </w:rPr>
-        <w:t>literatura</w:t>
-      </w:r>
-      <w:proofErr w:type="spellEnd"/>
-      <w:r>
-        <w:rPr>
-          <w:sz w:val="24"/>
-          <w:szCs w:val="24"/>
-        </w:rPr>
-        <w:t xml:space="preserve"> %}</w:t>
+          <w:b/>
+          <w:bCs/>
+          <w:color w:val="000000"/>
+          <w:sz w:val="24"/>
+          <w:szCs w:val="24"/>
+        </w:rPr>
+        <w:t>LITERATURA</w:t>
       </w:r>
     </w:p>
     <w:p>
@@ -19917,69 +20876,28 @@
           <w:szCs w:val="24"/>
         </w:rPr>
       </w:pPr>
-      <w:proofErr w:type="gramStart"/>
-      <w:r>
-        <w:rPr>
-          <w:sz w:val="24"/>
-          <w:szCs w:val="24"/>
-        </w:rPr>
-        <w:t xml:space="preserve">{{ </w:t>
-      </w:r>
-      <w:proofErr w:type="spellStart"/>
-      <w:r>
-        <w:rPr>
-          <w:sz w:val="24"/>
-          <w:szCs w:val="24"/>
-        </w:rPr>
-        <w:t>loop</w:t>
-      </w:r>
-      <w:proofErr w:type="gramEnd"/>
-      <w:r>
-        <w:rPr>
-          <w:sz w:val="24"/>
-          <w:szCs w:val="24"/>
-        </w:rPr>
-        <w:t>.index</w:t>
-      </w:r>
-      <w:proofErr w:type="spellEnd"/>
-      <w:r>
-        <w:rPr>
-          <w:sz w:val="24"/>
-          <w:szCs w:val="24"/>
-        </w:rPr>
-        <w:t xml:space="preserve"> }}. </w:t>
-      </w:r>
-      <w:proofErr w:type="gramStart"/>
-      <w:r>
-        <w:rPr>
-          <w:sz w:val="24"/>
-          <w:szCs w:val="24"/>
-        </w:rPr>
-        <w:t xml:space="preserve">{{ </w:t>
-      </w:r>
-      <w:proofErr w:type="spellStart"/>
-      <w:r>
-        <w:rPr>
-          <w:sz w:val="24"/>
-          <w:szCs w:val="24"/>
-        </w:rPr>
-        <w:t>ref</w:t>
-      </w:r>
-      <w:proofErr w:type="gramEnd"/>
-      <w:r>
-        <w:rPr>
-          <w:sz w:val="24"/>
-          <w:szCs w:val="24"/>
-        </w:rPr>
-        <w:t>.tekst</w:t>
-      </w:r>
-      <w:proofErr w:type="spellEnd"/>
-      <w:r>
-        <w:rPr>
-          <w:sz w:val="24"/>
-          <w:szCs w:val="24"/>
-        </w:rPr>
-        <w:t xml:space="preserve"> }}</w:t>
+      <w:r>
+        <w:rPr>
+          <w:sz w:val="24"/>
+          <w:szCs w:val="24"/>
+        </w:rPr>
+        <w:t xml:space="preserve">{%p for ref in </w:t>
+      </w:r>
+      <w:proofErr w:type="spellStart"/>
+      <w:r>
+        <w:rPr>
+          <w:sz w:val="24"/>
+          <w:szCs w:val="24"/>
+        </w:rPr>
+        <w:t>literatura</w:t>
+      </w:r>
+      <w:proofErr w:type="spellEnd"/>
+      <w:r>
+        <w:rPr>
+          <w:sz w:val="24"/>
+          <w:szCs w:val="24"/>
+        </w:rPr>
+        <w:t xml:space="preserve"> %}</w:t>
       </w:r>
     </w:p>
     <w:p>
@@ -19991,6 +20909,80 @@
           <w:szCs w:val="24"/>
         </w:rPr>
       </w:pPr>
+      <w:proofErr w:type="gramStart"/>
+      <w:r>
+        <w:rPr>
+          <w:sz w:val="24"/>
+          <w:szCs w:val="24"/>
+        </w:rPr>
+        <w:t xml:space="preserve">{{ </w:t>
+      </w:r>
+      <w:proofErr w:type="spellStart"/>
+      <w:r>
+        <w:rPr>
+          <w:sz w:val="24"/>
+          <w:szCs w:val="24"/>
+        </w:rPr>
+        <w:t>loop</w:t>
+      </w:r>
+      <w:proofErr w:type="gramEnd"/>
+      <w:r>
+        <w:rPr>
+          <w:sz w:val="24"/>
+          <w:szCs w:val="24"/>
+        </w:rPr>
+        <w:t>.index</w:t>
+      </w:r>
+      <w:proofErr w:type="spellEnd"/>
+      <w:r>
+        <w:rPr>
+          <w:sz w:val="24"/>
+          <w:szCs w:val="24"/>
+        </w:rPr>
+        <w:t xml:space="preserve"> }}. </w:t>
+      </w:r>
+      <w:proofErr w:type="gramStart"/>
+      <w:r>
+        <w:rPr>
+          <w:sz w:val="24"/>
+          <w:szCs w:val="24"/>
+        </w:rPr>
+        <w:t xml:space="preserve">{{ </w:t>
+      </w:r>
+      <w:proofErr w:type="spellStart"/>
+      <w:r>
+        <w:rPr>
+          <w:sz w:val="24"/>
+          <w:szCs w:val="24"/>
+        </w:rPr>
+        <w:t>ref</w:t>
+      </w:r>
+      <w:proofErr w:type="gramEnd"/>
+      <w:r>
+        <w:rPr>
+          <w:sz w:val="24"/>
+          <w:szCs w:val="24"/>
+        </w:rPr>
+        <w:t>.tekst</w:t>
+      </w:r>
+      <w:proofErr w:type="spellEnd"/>
+      <w:r>
+        <w:rPr>
+          <w:sz w:val="24"/>
+          <w:szCs w:val="24"/>
+        </w:rPr>
+        <w:t xml:space="preserve"> }}</w:t>
+      </w:r>
+    </w:p>
+    <w:p>
+      <w:pPr>
+        <w:spacing w:after="200" w:line="240" w:lineRule="auto"/>
+        <w:jc w:val="both"/>
+        <w:rPr>
+          <w:sz w:val="24"/>
+          <w:szCs w:val="24"/>
+        </w:rPr>
+      </w:pPr>
       <w:r>
         <w:rPr>
           <w:sz w:val="24"/>
@@ -20014,8 +21006,6 @@
         </w:rPr>
         <w:t xml:space="preserve"> %}</w:t>
       </w:r>
-      <w:bookmarkStart w:id="1" w:name="_GoBack"/>
-      <w:bookmarkEnd w:id="1"/>
     </w:p>
     <w:sectPr>
       <w:footerReference w:type="default" r:id="rId16"/>

</xml_diff>